<commit_message>
docs(submission): add AI-use disclosure to P4, P5, P10
Complete AI-use disclosure coverage across all papers (P3/P6/P7/P8/P9/P11
already had it). P4/P5: 'Use of generative AI' section matching P3's
style; P10: disclosure on the title page. Rebuilt affected docx. Now all
11 component papers carry a disclosure consistent with JIBS/Emerald/
Elsevier policy.
</commit_message>
<xml_diff>
--- a/p10_japan/submission/abm_package/02_title_page.docx
+++ b/p10_japan/submission/abm_package/02_title_page.docx
@@ -181,6 +181,36 @@
       </w:r>
       <w:r>
         <w:t xml:space="preserve">).</w:t>
+      </w:r>
+    </w:p>
+    <w:p>
+      <w:pPr>
+        <w:pStyle w:val="BodyText"/>
+      </w:pPr>
+      <w:r>
+        <w:rPr>
+          <w:bCs/>
+          <w:b/>
+        </w:rPr>
+        <w:t xml:space="preserve">AI-use disclosure.</w:t>
+      </w:r>
+      <w:r>
+        <w:t xml:space="preserve"> </w:t>
+      </w:r>
+      <w:r>
+        <w:t xml:space="preserve">Generative-AI tools were used to assist with prose drafting, code refactoring, and language editing. All research design, variable construction, model specification, estimation, interpretation, and scientific conclusions are the authors' own work and responsibility; no result was accepted on an AI's assertion, and all reported quantitative results are reproducible from</w:t>
+      </w:r>
+      <w:r>
+        <w:t xml:space="preserve"> </w:t>
+      </w:r>
+      <w:r>
+        <w:rPr>
+          <w:rStyle w:val="VerbatimChar"/>
+        </w:rPr>
+        <w:t xml:space="preserve">p10_japan/replication/p10_japan_models.py</w:t>
+      </w:r>
+      <w:r>
+        <w:t xml:space="preserve">.</w:t>
       </w:r>
     </w:p>
     <w:bookmarkEnd w:id="21"/>

</xml_diff>

<commit_message>
style(p10): anti-AI em-dash pass on Japan title pages
Replace the prose em-dash in the corresponding-author line with a comma on all
three P10 submission title pages (ABM, APJM, IJOEM) and rebuild the .docx.
Manuscript em-dashes are all legitimate 'Algebraic TP' table placeholders.
P10 numbers reconcile cleanly against the replication source of truth (M1
+0.671***, M2 quadratic -0.606 n.s., export premium 25.8%, all descriptives
match REPRO_2026-06-23); no number changes needed.

Co-Authored-By: Claude Opus 4.8 (1M context) <noreply@anthropic.com>
Claude-Session: https://claude.ai/code/session_01Xumaoraa2DLWLXsgJJ62oq
</commit_message>
<xml_diff>
--- a/p10_japan/submission/abm_package/02_title_page.docx
+++ b/p10_japan/submission/abm_package/02_title_page.docx
@@ -2,13 +2,13 @@
 <file path=word/document.xml><?xml version="1.0" encoding="utf-8"?>
 <w:document xmlns:w="http://schemas.openxmlformats.org/wordprocessingml/2006/main" xmlns:m="http://schemas.openxmlformats.org/officeDocument/2006/math" xmlns:r="http://schemas.openxmlformats.org/officeDocument/2006/relationships" xmlns:o="urn:schemas-microsoft-com:office:office" xmlns:v="urn:schemas-microsoft-com:vml" xmlns:w10="urn:schemas-microsoft-com:office:word" xmlns:a="http://schemas.openxmlformats.org/drawingml/2006/main" xmlns:pic="http://schemas.openxmlformats.org/drawingml/2006/picture" xmlns:wp="http://schemas.openxmlformats.org/drawingml/2006/wordprocessingDrawing">
   <w:body>
-    <w:bookmarkStart w:id="21" w:name="X9ce5bbd905343601642ad7fa420f5abf549f0eb"/>
+    <w:bookmarkStart w:id="20" w:name="X9ce5bbd905343601642ad7fa420f5abf549f0eb"/>
     <w:p>
       <w:pPr>
         <w:pStyle w:val="Heading1"/>
       </w:pPr>
       <w:r>
-        <w:t xml:space="preserve">At the Upper Bound of the Institutional Gradient: Internationalization, Capabilities, and Firm Performance in Japan's Inaugural World Bank Enterprise Survey</w:t>
+        <w:t xml:space="preserve">At the Upper Bound of the Institutional Gradient: Internationalization, Capabilities, and Firm Performance in Japan’s Inaugural World Bank Enterprise Survey</w:t>
       </w:r>
     </w:p>
     <w:p>
@@ -68,19 +68,8 @@
         <w:t xml:space="preserve"> </w:t>
       </w:r>
       <w:r>
-        <w:t xml:space="preserve">Đỗ Thùy Hương —</w:t>
-      </w:r>
-      <w:r>
-        <w:t xml:space="preserve"> </w:t>
-      </w:r>
-      <w:hyperlink r:id="rId20">
-        <w:r>
-          <w:rPr>
-            <w:rStyle w:val="Hyperlink"/>
-          </w:rPr>
-          <w:t xml:space="preserve">huongdt@vlute.edu.vn</w:t>
-        </w:r>
-      </w:hyperlink>
+        <w:t xml:space="preserve">Đỗ Thùy Hương, huongdt@vlute.edu.vn</w:t>
+      </w:r>
     </w:p>
     <w:p>
       <w:pPr>
@@ -97,7 +86,7 @@
         <w:t xml:space="preserve"> </w:t>
       </w:r>
       <w:r>
-        <w:t xml:space="preserve">This study is part of the corresponding author's doctoral</w:t>
+        <w:t xml:space="preserve">This study is part of the corresponding author’s doctoral</w:t>
       </w:r>
       <w:r>
         <w:t xml:space="preserve"> </w:t>
@@ -109,7 +98,7 @@
         <w:t xml:space="preserve"> </w:t>
       </w:r>
       <w:r>
-        <w:t xml:space="preserve">used under the programme's research licence.</w:t>
+        <w:t xml:space="preserve">used under the programme’s research licence.</w:t>
       </w:r>
     </w:p>
     <w:p>
@@ -198,7 +187,7 @@
         <w:t xml:space="preserve"> </w:t>
       </w:r>
       <w:r>
-        <w:t xml:space="preserve">Generative-AI tools were used to assist with prose drafting, code refactoring, and language editing. All research design, variable construction, model specification, estimation, interpretation, and scientific conclusions are the authors' own work and responsibility; no result was accepted on an AI's assertion, and all reported quantitative results are reproducible from</w:t>
+        <w:t xml:space="preserve">Generative-AI tools were used to assist with prose drafting, code refactoring, and language editing. All research design, variable construction, model specification, estimation, interpretation, and scientific conclusions are the authors’ own work and responsibility; no result was accepted on an AI’s assertion, and all reported quantitative results are reproducible from</w:t>
       </w:r>
       <w:r>
         <w:t xml:space="preserve"> </w:t>
@@ -213,11 +202,8 @@
         <w:t xml:space="preserve">.</w:t>
       </w:r>
     </w:p>
-    <w:bookmarkEnd w:id="21"/>
-    <w:sectPr>
-      <w:pgSz w:h="16838" w:w="11906"/>
-      <w:pgMar w:bottom="1417" w:left="1417" w:right="1417" w:top="1417"/>
-    </w:sectPr>
+    <w:bookmarkEnd w:id="20"/>
+    <w:sectPr/>
   </w:body>
 </w:document>
 </file>
@@ -350,59 +336,29 @@
   <w:style w:default="1" w:styleId="Normal" w:type="paragraph">
     <w:name w:val="Normal"/>
     <w:qFormat/>
-    <w:pPr>
-      <w:spacing w:line="276" w:lineRule="auto"/>
-      <w:jc w:val="both"/>
-    </w:pPr>
-    <w:rPr>
-      <w:rFonts w:ascii="Times New Roman" w:eastAsia="Times New Roman" w:hAnsi="Times New Roman"/>
-      <w:color w:val="000000"/>
-      <w:sz w:val="24"/>
-    </w:rPr>
   </w:style>
   <w:style w:styleId="BodyText" w:type="paragraph">
     <w:name w:val="Body Text"/>
     <w:basedOn w:val="Normal"/>
     <w:link w:val="BodyTextChar"/>
     <w:pPr>
-      <w:spacing w:after="180" w:before="180" w:line="276" w:lineRule="auto"/>
-      <w:jc w:val="both"/>
-    </w:pPr>
-    <w:qFormat/>
-    <w:rPr>
-      <w:rFonts w:ascii="Times New Roman" w:eastAsia="Times New Roman" w:hAnsi="Times New Roman"/>
-      <w:color w:val="000000"/>
-      <w:sz w:val="24"/>
-    </w:rPr>
+      <w:spacing w:after="180" w:before="180"/>
+    </w:pPr>
+    <w:qFormat/>
   </w:style>
   <w:style w:customStyle="1" w:styleId="FirstParagraph" w:type="paragraph">
     <w:name w:val="First Paragraph"/>
     <w:basedOn w:val="BodyText"/>
     <w:next w:val="BodyText"/>
     <w:qFormat/>
-    <w:pPr>
-      <w:spacing w:line="276" w:lineRule="auto"/>
-      <w:jc w:val="both"/>
-    </w:pPr>
-    <w:rPr>
-      <w:rFonts w:ascii="Times New Roman" w:eastAsia="Times New Roman" w:hAnsi="Times New Roman"/>
-      <w:color w:val="000000"/>
-      <w:sz w:val="24"/>
-    </w:rPr>
   </w:style>
   <w:style w:customStyle="1" w:styleId="Compact" w:type="paragraph">
     <w:name w:val="Compact"/>
     <w:basedOn w:val="BodyText"/>
     <w:qFormat/>
     <w:pPr>
-      <w:spacing w:after="36" w:before="36" w:line="276" w:lineRule="auto"/>
-      <w:jc w:val="both"/>
-    </w:pPr>
-    <w:rPr>
-      <w:rFonts w:ascii="Times New Roman" w:eastAsia="Times New Roman" w:hAnsi="Times New Roman"/>
-      <w:color w:val="000000"/>
-      <w:sz w:val="24"/>
-    </w:rPr>
+      <w:spacing w:after="36" w:before="36"/>
+    </w:pPr>
   </w:style>
   <w:style w:styleId="Title" w:type="paragraph">
     <w:name w:val="Title"/>
@@ -412,15 +368,15 @@
     <w:pPr>
       <w:keepNext/>
       <w:keepLines/>
-      <w:spacing w:after="240" w:before="480" w:line="276" w:lineRule="auto"/>
-      <w:jc w:val="both"/>
-    </w:pPr>
-    <w:rPr>
-      <w:rFonts w:ascii="Times New Roman" w:asciiTheme="majorHAnsi" w:cstheme="majorBidi" w:eastAsia="Times New Roman" w:eastAsiaTheme="majorEastAsia" w:hAnsi="Times New Roman" w:hAnsiTheme="majorHAnsi"/>
+      <w:spacing w:after="240" w:before="480"/>
+      <w:jc w:val="center"/>
+    </w:pPr>
+    <w:rPr>
+      <w:rFonts w:asciiTheme="majorHAnsi" w:cstheme="majorBidi" w:eastAsiaTheme="majorEastAsia" w:hAnsiTheme="majorHAnsi"/>
       <w:b/>
       <w:bCs/>
-      <w:color w:val="000000"/>
-      <w:sz w:val="24"/>
+      <w:color w:themeColor="accent1" w:themeShade="B5" w:val="345A8A"/>
+      <w:sz w:val="36"/>
       <w:szCs w:val="36"/>
     </w:rPr>
   </w:style>
@@ -432,13 +388,11 @@
     <w:pPr>
       <w:keepNext/>
       <w:keepLines/>
-      <w:spacing w:after="240" w:before="240" w:line="276" w:lineRule="auto"/>
-      <w:jc w:val="both"/>
-    </w:pPr>
-    <w:rPr>
-      <w:rFonts w:ascii="Times New Roman" w:eastAsia="Times New Roman" w:hAnsi="Times New Roman"/>
-      <w:color w:val="000000"/>
-      <w:sz w:val="24"/>
+      <w:spacing w:after="240" w:before="240"/>
+      <w:jc w:val="center"/>
+    </w:pPr>
+    <w:rPr>
+      <w:sz w:val="30"/>
       <w:szCs w:val="30"/>
     </w:rPr>
   </w:style>
@@ -449,14 +403,8 @@
     <w:pPr>
       <w:keepNext/>
       <w:keepLines/>
-      <w:spacing w:line="276" w:lineRule="auto"/>
-      <w:jc w:val="both"/>
-    </w:pPr>
-    <w:rPr>
-      <w:rFonts w:ascii="Times New Roman" w:eastAsia="Times New Roman" w:hAnsi="Times New Roman"/>
-      <w:color w:val="000000"/>
-      <w:sz w:val="24"/>
-    </w:rPr>
+      <w:jc w:val="center"/>
+    </w:pPr>
   </w:style>
   <w:style w:styleId="Date" w:type="paragraph">
     <w:name w:val="Date"/>
@@ -465,14 +413,8 @@
     <w:pPr>
       <w:keepNext/>
       <w:keepLines/>
-      <w:spacing w:line="276" w:lineRule="auto"/>
-      <w:jc w:val="both"/>
-    </w:pPr>
-    <w:rPr>
-      <w:rFonts w:ascii="Times New Roman" w:eastAsia="Times New Roman" w:hAnsi="Times New Roman"/>
-      <w:color w:val="000000"/>
-      <w:sz w:val="24"/>
-    </w:rPr>
+      <w:jc w:val="center"/>
+    </w:pPr>
   </w:style>
   <w:style w:customStyle="1" w:styleId="AbstractTitle" w:type="paragraph">
     <w:name w:val="Abstract Title"/>
@@ -482,15 +424,15 @@
     <w:pPr>
       <w:keepNext/>
       <w:keepLines/>
-      <w:jc w:val="both"/>
-      <w:spacing w:after="0" w:before="300" w:line="276" w:lineRule="auto"/>
-    </w:pPr>
-    <w:rPr>
-      <w:color w:val="000000"/>
-      <w:sz w:val="24"/>
+      <w:jc w:val="center"/>
+      <w:spacing w:after="0" w:before="300"/>
+    </w:pPr>
+    <w:rPr>
+      <w:sz w:val="20"/>
       <w:szCs w:val="20"/>
-      <w:rFonts w:ascii="Times New Roman" w:eastAsia="Times New Roman" w:hAnsi="Times New Roman"/>
-      <w:b/>
+      <w:b/>
+      <w:color w:val="345A8A"/>
+      &gt;
     </w:rPr>
   </w:style>
   <w:style w:customStyle="1" w:styleId="Abstract" w:type="paragraph">
@@ -501,13 +443,10 @@
     <w:pPr>
       <w:keepNext/>
       <w:keepLines/>
-      <w:spacing w:after="300" w:before="100" w:line="276" w:lineRule="auto"/>
-      <w:jc w:val="both"/>
-    </w:pPr>
-    <w:rPr>
-      <w:rFonts w:ascii="Times New Roman" w:eastAsia="Times New Roman" w:hAnsi="Times New Roman"/>
-      <w:color w:val="000000"/>
-      <w:sz w:val="24"/>
+      <w:spacing w:after="300" w:before="100"/>
+    </w:pPr>
+    <w:rPr>
+      <w:sz w:val="20"/>
       <w:szCs w:val="20"/>
     </w:rPr>
   </w:style>
@@ -516,15 +455,8 @@
     <w:basedOn w:val="Normal"/>
     <w:next w:val="Bibliography"/>
     <w:qFormat/>
-    <w:pPr>
-      <w:spacing w:line="276" w:lineRule="auto"/>
-      <w:jc w:val="both"/>
-    </w:pPr>
-    <w:rPr>
-      <w:rFonts w:ascii="Times New Roman" w:eastAsia="Times New Roman" w:hAnsi="Times New Roman"/>
-      <w:color w:val="000000"/>
-      <w:sz w:val="24"/>
-    </w:rPr>
+    <w:pPr/>
+    <w:rPr/>
   </w:style>
   <w:style w:styleId="Heading1" w:type="paragraph">
     <w:name w:val="Heading 1"/>
@@ -535,16 +467,15 @@
     <w:pPr>
       <w:keepNext/>
       <w:keepLines/>
-      <w:spacing w:after="0" w:before="480" w:line="276" w:lineRule="auto"/>
-      <w:jc w:val="both"/>
+      <w:spacing w:after="0" w:before="480"/>
       <w:outlineLvl w:val="0"/>
     </w:pPr>
     <w:rPr>
-      <w:rFonts w:ascii="Times New Roman" w:asciiTheme="majorHAnsi" w:cstheme="majorBidi" w:eastAsia="Times New Roman" w:eastAsiaTheme="majorEastAsia" w:hAnsi="Times New Roman" w:hAnsiTheme="majorHAnsi"/>
+      <w:rFonts w:asciiTheme="majorHAnsi" w:cstheme="majorBidi" w:eastAsiaTheme="majorEastAsia" w:hAnsiTheme="majorHAnsi"/>
       <w:b/>
       <w:bCs/>
-      <w:color w:val="000000"/>
-      <w:sz w:val="24"/>
+      <w:color w:themeColor="accent1" w:val="4F81BD"/>
+      <w:sz w:val="32"/>
       <w:szCs w:val="32"/>
     </w:rPr>
   </w:style>
@@ -558,16 +489,15 @@
     <w:pPr>
       <w:keepNext/>
       <w:keepLines/>
-      <w:spacing w:after="0" w:before="200" w:line="276" w:lineRule="auto"/>
-      <w:jc w:val="both"/>
+      <w:spacing w:after="0" w:before="200"/>
       <w:outlineLvl w:val="1"/>
     </w:pPr>
     <w:rPr>
-      <w:rFonts w:ascii="Times New Roman" w:asciiTheme="majorHAnsi" w:cstheme="majorBidi" w:eastAsia="Times New Roman" w:eastAsiaTheme="majorEastAsia" w:hAnsi="Times New Roman" w:hAnsiTheme="majorHAnsi"/>
+      <w:rFonts w:asciiTheme="majorHAnsi" w:cstheme="majorBidi" w:eastAsiaTheme="majorEastAsia" w:hAnsiTheme="majorHAnsi"/>
       <w:b/>
       <w:bCs/>
-      <w:color w:val="000000"/>
-      <w:sz w:val="24"/>
+      <w:color w:themeColor="accent1" w:val="4F81BD"/>
+      <w:sz w:val="28"/>
       <w:szCs w:val="28"/>
     </w:rPr>
   </w:style>
@@ -581,15 +511,14 @@
     <w:pPr>
       <w:keepNext/>
       <w:keepLines/>
-      <w:spacing w:after="0" w:before="200" w:line="276" w:lineRule="auto"/>
-      <w:jc w:val="both"/>
+      <w:spacing w:after="0" w:before="200"/>
       <w:outlineLvl w:val="2"/>
     </w:pPr>
     <w:rPr>
-      <w:rFonts w:ascii="Times New Roman" w:asciiTheme="majorHAnsi" w:cstheme="majorBidi" w:eastAsia="Times New Roman" w:eastAsiaTheme="majorEastAsia" w:hAnsi="Times New Roman" w:hAnsiTheme="majorHAnsi"/>
+      <w:rFonts w:asciiTheme="majorHAnsi" w:cstheme="majorBidi" w:eastAsiaTheme="majorEastAsia" w:hAnsiTheme="majorHAnsi"/>
       <w:b/>
       <w:bCs/>
-      <w:color w:val="000000"/>
+      <w:color w:themeColor="accent1" w:val="4F81BD"/>
       <w:sz w:val="24"/>
       <w:szCs w:val="24"/>
     </w:rPr>
@@ -604,15 +533,14 @@
     <w:pPr>
       <w:keepNext/>
       <w:keepLines/>
-      <w:spacing w:after="0" w:before="200" w:line="276" w:lineRule="auto"/>
-      <w:jc w:val="both"/>
+      <w:spacing w:after="0" w:before="200"/>
       <w:outlineLvl w:val="3"/>
     </w:pPr>
     <w:rPr>
-      <w:rFonts w:ascii="Times New Roman" w:asciiTheme="majorHAnsi" w:cstheme="majorBidi" w:eastAsia="Times New Roman" w:eastAsiaTheme="majorEastAsia" w:hAnsi="Times New Roman" w:hAnsiTheme="majorHAnsi"/>
+      <w:rFonts w:asciiTheme="majorHAnsi" w:cstheme="majorBidi" w:eastAsiaTheme="majorEastAsia" w:hAnsiTheme="majorHAnsi"/>
       <w:i/>
       <w:bCs/>
-      <w:color w:val="000000"/>
+      <w:color w:themeColor="accent1" w:val="4F81BD"/>
       <w:sz w:val="24"/>
       <w:szCs w:val="24"/>
     </w:rPr>
@@ -627,14 +555,13 @@
     <w:pPr>
       <w:keepNext/>
       <w:keepLines/>
-      <w:spacing w:after="0" w:before="200" w:line="276" w:lineRule="auto"/>
-      <w:jc w:val="both"/>
+      <w:spacing w:after="0" w:before="200"/>
       <w:outlineLvl w:val="4"/>
     </w:pPr>
     <w:rPr>
-      <w:rFonts w:ascii="Times New Roman" w:asciiTheme="majorHAnsi" w:cstheme="majorBidi" w:eastAsia="Times New Roman" w:eastAsiaTheme="majorEastAsia" w:hAnsi="Times New Roman" w:hAnsiTheme="majorHAnsi"/>
+      <w:rFonts w:asciiTheme="majorHAnsi" w:cstheme="majorBidi" w:eastAsiaTheme="majorEastAsia" w:hAnsiTheme="majorHAnsi"/>
       <w:iCs/>
-      <w:color w:val="000000"/>
+      <w:color w:themeColor="accent1" w:val="4F81BD"/>
       <w:sz w:val="24"/>
       <w:szCs w:val="24"/>
     </w:rPr>
@@ -649,13 +576,12 @@
     <w:pPr>
       <w:keepNext/>
       <w:keepLines/>
-      <w:spacing w:after="0" w:before="200" w:line="276" w:lineRule="auto"/>
-      <w:jc w:val="both"/>
+      <w:spacing w:after="0" w:before="200"/>
       <w:outlineLvl w:val="5"/>
     </w:pPr>
     <w:rPr>
-      <w:rFonts w:ascii="Times New Roman" w:asciiTheme="majorHAnsi" w:cstheme="majorBidi" w:eastAsia="Times New Roman" w:eastAsiaTheme="majorEastAsia" w:hAnsi="Times New Roman" w:hAnsiTheme="majorHAnsi"/>
-      <w:color w:val="000000"/>
+      <w:rFonts w:asciiTheme="majorHAnsi" w:cstheme="majorBidi" w:eastAsiaTheme="majorEastAsia" w:hAnsiTheme="majorHAnsi"/>
+      <w:color w:themeColor="accent1" w:val="4F81BD"/>
       <w:sz w:val="24"/>
       <w:szCs w:val="24"/>
     </w:rPr>
@@ -670,13 +596,12 @@
     <w:pPr>
       <w:keepNext/>
       <w:keepLines/>
-      <w:spacing w:after="0" w:before="200" w:line="276" w:lineRule="auto"/>
-      <w:jc w:val="both"/>
+      <w:spacing w:after="0" w:before="200"/>
       <w:outlineLvl w:val="6"/>
     </w:pPr>
     <w:rPr>
-      <w:rFonts w:ascii="Times New Roman" w:asciiTheme="majorHAnsi" w:cstheme="majorBidi" w:eastAsia="Times New Roman" w:eastAsiaTheme="majorEastAsia" w:hAnsi="Times New Roman" w:hAnsiTheme="majorHAnsi"/>
-      <w:color w:val="000000"/>
+      <w:rFonts w:asciiTheme="majorHAnsi" w:cstheme="majorBidi" w:eastAsiaTheme="majorEastAsia" w:hAnsiTheme="majorHAnsi"/>
+      <w:color w:themeColor="accent1" w:val="4F81BD"/>
       <w:sz w:val="24"/>
       <w:szCs w:val="24"/>
     </w:rPr>
@@ -691,13 +616,12 @@
     <w:pPr>
       <w:keepNext/>
       <w:keepLines/>
-      <w:spacing w:after="0" w:before="200" w:line="276" w:lineRule="auto"/>
-      <w:jc w:val="both"/>
+      <w:spacing w:after="0" w:before="200"/>
       <w:outlineLvl w:val="7"/>
     </w:pPr>
     <w:rPr>
-      <w:rFonts w:ascii="Times New Roman" w:asciiTheme="majorHAnsi" w:cstheme="majorBidi" w:eastAsia="Times New Roman" w:eastAsiaTheme="majorEastAsia" w:hAnsi="Times New Roman" w:hAnsiTheme="majorHAnsi"/>
-      <w:color w:val="000000"/>
+      <w:rFonts w:asciiTheme="majorHAnsi" w:cstheme="majorBidi" w:eastAsiaTheme="majorEastAsia" w:hAnsiTheme="majorHAnsi"/>
+      <w:color w:themeColor="accent1" w:val="4F81BD"/>
       <w:sz w:val="24"/>
       <w:szCs w:val="24"/>
     </w:rPr>
@@ -712,13 +636,12 @@
     <w:pPr>
       <w:keepNext/>
       <w:keepLines/>
-      <w:spacing w:after="0" w:before="200" w:line="276" w:lineRule="auto"/>
-      <w:jc w:val="both"/>
+      <w:spacing w:after="0" w:before="200"/>
       <w:outlineLvl w:val="8"/>
     </w:pPr>
     <w:rPr>
-      <w:rFonts w:ascii="Times New Roman" w:asciiTheme="majorHAnsi" w:cstheme="majorBidi" w:eastAsia="Times New Roman" w:eastAsiaTheme="majorEastAsia" w:hAnsi="Times New Roman" w:hAnsiTheme="majorHAnsi"/>
-      <w:color w:val="000000"/>
+      <w:rFonts w:asciiTheme="majorHAnsi" w:cstheme="majorBidi" w:eastAsiaTheme="majorEastAsia" w:hAnsiTheme="majorHAnsi"/>
+      <w:color w:themeColor="accent1" w:val="4F81BD"/>
       <w:sz w:val="24"/>
       <w:szCs w:val="24"/>
     </w:rPr>
@@ -731,15 +654,9 @@
     <w:unhideWhenUsed/>
     <w:qFormat/>
     <w:pPr>
-      <w:spacing w:after="100" w:before="100" w:line="276" w:lineRule="auto"/>
+      <w:spacing w:after="100" w:before="100"/>
       <w:ind w:firstLine="0" w:left="480" w:right="480"/>
-      <w:jc w:val="both"/>
-    </w:pPr>
-    <w:rPr>
-      <w:rFonts w:ascii="Times New Roman" w:eastAsia="Times New Roman" w:hAnsi="Times New Roman"/>
-      <w:color w:val="000000"/>
-      <w:sz w:val="24"/>
-    </w:rPr>
+    </w:pPr>
   </w:style>
   <w:style w:styleId="FootnoteText" w:type="paragraph">
     <w:name w:val="Footnote Text"/>
@@ -748,25 +665,11 @@
     <w:uiPriority w:val="9"/>
     <w:unhideWhenUsed/>
     <w:qFormat/>
-    <w:pPr>
-      <w:spacing w:line="276" w:lineRule="auto"/>
-      <w:jc w:val="both"/>
-    </w:pPr>
-    <w:rPr>
-      <w:rFonts w:ascii="Times New Roman" w:eastAsia="Times New Roman" w:hAnsi="Times New Roman"/>
-      <w:color w:val="000000"/>
-      <w:sz w:val="24"/>
-    </w:rPr>
   </w:style>
   <w:style w:default="1" w:styleId="DefaultParagraphFont" w:type="character">
     <w:name w:val="Default Paragraph Font"/>
     <w:semiHidden/>
     <w:unhideWhenUsed/>
-    <w:rPr>
-      <w:rFonts w:ascii="Times New Roman" w:eastAsia="Times New Roman" w:hAnsi="Times New Roman"/>
-      <w:color w:val="000000"/>
-      <w:sz w:val="24"/>
-    </w:rPr>
   </w:style>
   <w:style w:default="1" w:styleId="Table" w:type="table">
     <w:name w:val="Table"/>
@@ -774,15 +677,6 @@
     <w:semiHidden/>
     <w:unhideWhenUsed/>
     <w:qFormat/>
-    <w:pPr>
-      <w:spacing w:line="276" w:lineRule="auto"/>
-      <w:jc w:val="both"/>
-    </w:pPr>
-    <w:rPr>
-      <w:rFonts w:ascii="Times New Roman" w:eastAsia="Times New Roman" w:hAnsi="Times New Roman"/>
-      <w:color w:val="000000"/>
-      <w:sz w:val="24"/>
-    </w:rPr>
     <w:tblPr>
       <w:tblInd w:type="dxa" w:w="0"/>
       <w:tblCellMar>
@@ -815,42 +709,25 @@
     <w:pPr>
       <w:keepNext/>
       <w:keepLines/>
-      <w:spacing w:after="0" w:line="276" w:lineRule="auto"/>
-      <w:jc w:val="both"/>
-    </w:pPr>
-    <w:rPr>
-      <w:rFonts w:ascii="Times New Roman" w:eastAsia="Times New Roman" w:hAnsi="Times New Roman"/>
-      <w:b/>
-      <w:color w:val="000000"/>
-      <w:sz w:val="24"/>
+      <w:spacing w:after="0"/>
+    </w:pPr>
+    <w:rPr>
+      <w:b/>
     </w:rPr>
   </w:style>
   <w:style w:customStyle="1" w:styleId="Definition" w:type="paragraph">
     <w:name w:val="Definition"/>
     <w:basedOn w:val="Normal"/>
-    <w:pPr>
-      <w:spacing w:line="276" w:lineRule="auto"/>
-      <w:jc w:val="both"/>
-    </w:pPr>
-    <w:rPr>
-      <w:rFonts w:ascii="Times New Roman" w:eastAsia="Times New Roman" w:hAnsi="Times New Roman"/>
-      <w:color w:val="000000"/>
-      <w:sz w:val="24"/>
-    </w:rPr>
   </w:style>
   <w:style w:styleId="Caption" w:type="paragraph">
     <w:name w:val="Caption"/>
     <w:basedOn w:val="Normal"/>
     <w:link w:val="BodyTextChar"/>
     <w:pPr>
-      <w:spacing w:after="120" w:before="0" w:line="276" w:lineRule="auto"/>
-      <w:jc w:val="both"/>
-    </w:pPr>
-    <w:rPr>
-      <w:rFonts w:ascii="Times New Roman" w:eastAsia="Times New Roman" w:hAnsi="Times New Roman"/>
+      <w:spacing w:after="120" w:before="0"/>
+    </w:pPr>
+    <w:rPr>
       <w:i/>
-      <w:color w:val="000000"/>
-      <w:sz w:val="24"/>
     </w:rPr>
   </w:style>
   <w:style w:customStyle="1" w:styleId="TableCaption" w:type="paragraph">
@@ -858,90 +735,44 @@
     <w:basedOn w:val="Caption"/>
     <w:pPr>
       <w:keepNext/>
-      <w:spacing w:line="276" w:lineRule="auto"/>
-      <w:jc w:val="both"/>
-    </w:pPr>
-    <w:rPr>
-      <w:rFonts w:ascii="Times New Roman" w:eastAsia="Times New Roman" w:hAnsi="Times New Roman"/>
-      <w:color w:val="000000"/>
-      <w:sz w:val="24"/>
-    </w:rPr>
+    </w:pPr>
   </w:style>
   <w:style w:customStyle="1" w:styleId="ImageCaption" w:type="paragraph">
     <w:name w:val="Image Caption"/>
     <w:basedOn w:val="Caption"/>
-    <w:pPr>
-      <w:spacing w:line="276" w:lineRule="auto"/>
-      <w:jc w:val="both"/>
-    </w:pPr>
-    <w:rPr>
-      <w:rFonts w:ascii="Times New Roman" w:eastAsia="Times New Roman" w:hAnsi="Times New Roman"/>
-      <w:color w:val="000000"/>
-      <w:sz w:val="24"/>
-    </w:rPr>
   </w:style>
   <w:style w:customStyle="1" w:styleId="Figure" w:type="paragraph">
     <w:name w:val="Figure"/>
     <w:basedOn w:val="Normal"/>
-    <w:pPr>
-      <w:spacing w:line="276" w:lineRule="auto"/>
-      <w:jc w:val="both"/>
-    </w:pPr>
-    <w:rPr>
-      <w:rFonts w:ascii="Times New Roman" w:eastAsia="Times New Roman" w:hAnsi="Times New Roman"/>
-      <w:color w:val="000000"/>
-      <w:sz w:val="24"/>
-    </w:rPr>
   </w:style>
   <w:style w:customStyle="1" w:styleId="CaptionedFigure" w:type="paragraph">
     <w:name w:val="Captioned Figure"/>
     <w:basedOn w:val="Figure"/>
     <w:pPr>
       <w:keepNext/>
-      <w:spacing w:line="276" w:lineRule="auto"/>
-      <w:jc w:val="both"/>
-    </w:pPr>
-    <w:rPr>
-      <w:rFonts w:ascii="Times New Roman" w:eastAsia="Times New Roman" w:hAnsi="Times New Roman"/>
-      <w:color w:val="000000"/>
-      <w:sz w:val="24"/>
-    </w:rPr>
+    </w:pPr>
   </w:style>
   <w:style w:customStyle="1" w:styleId="BodyTextChar" w:type="character">
     <w:name w:val="Body Text Char"/>
     <w:basedOn w:val="DefaultParagraphFont"/>
     <w:link w:val="BodyText"/>
-    <w:rPr>
-      <w:rFonts w:ascii="Times New Roman" w:eastAsia="Times New Roman" w:hAnsi="Times New Roman"/>
-      <w:color w:val="000000"/>
-      <w:sz w:val="24"/>
-    </w:rPr>
   </w:style>
   <w:style w:customStyle="1" w:styleId="VerbatimChar" w:type="character">
     <w:name w:val="Verbatim Char"/>
     <w:basedOn w:val="BodyTextChar"/>
     <w:rPr>
-      <w:rFonts w:ascii="Times New Roman" w:eastAsia="Times New Roman" w:hAnsi="Times New Roman"/>
-      <w:color w:val="000000"/>
-      <w:sz w:val="24"/>
+      <w:rFonts w:ascii="Consolas" w:hAnsi="Consolas"/>
+      <w:sz w:val="22"/>
     </w:rPr>
   </w:style>
   <w:style w:customStyle="1" w:styleId="SectionNumber" w:type="character">
     <w:name w:val="Section Number"/>
     <w:basedOn w:val="BodyTextChar"/>
-    <w:rPr>
-      <w:rFonts w:ascii="Times New Roman" w:eastAsia="Times New Roman" w:hAnsi="Times New Roman"/>
-      <w:color w:val="000000"/>
-      <w:sz w:val="24"/>
-    </w:rPr>
   </w:style>
   <w:style w:styleId="FootnoteReference" w:type="character">
     <w:name w:val="Footnote Reference"/>
     <w:basedOn w:val="BodyTextChar"/>
     <w:rPr>
-      <w:rFonts w:ascii="Times New Roman" w:eastAsia="Times New Roman" w:hAnsi="Times New Roman"/>
-      <w:color w:val="000000"/>
-      <w:sz w:val="24"/>
       <w:vertAlign w:val="superscript"/>
     </w:rPr>
   </w:style>
@@ -949,9 +780,7 @@
     <w:name w:val="Hyperlink"/>
     <w:basedOn w:val="BodyTextChar"/>
     <w:rPr>
-      <w:rFonts w:ascii="Times New Roman" w:eastAsia="Times New Roman" w:hAnsi="Times New Roman"/>
-      <w:color w:val="000000"/>
-      <w:sz w:val="24"/>
+      <w:color w:themeColor="accent1" w:val="4F81BD"/>
     </w:rPr>
   </w:style>
   <w:style w:styleId="TOCHeading" w:type="paragraph">
@@ -962,16 +791,14 @@
     <w:unhideWhenUsed/>
     <w:qFormat/>
     <w:pPr>
-      <w:spacing w:before="240" w:line="276" w:lineRule="auto"/>
-      <w:jc w:val="both"/>
+      <w:spacing w:before="240" w:line="259" w:lineRule="auto"/>
       <w:outlineLvl w:val="9"/>
     </w:pPr>
     <w:rPr>
-      <w:rFonts w:ascii="Times New Roman" w:asciiTheme="majorHAnsi" w:cstheme="majorBidi" w:eastAsia="Times New Roman" w:eastAsiaTheme="majorEastAsia" w:hAnsi="Times New Roman" w:hAnsiTheme="majorHAnsi"/>
+      <w:rFonts w:asciiTheme="majorHAnsi" w:cstheme="majorBidi" w:eastAsiaTheme="majorEastAsia" w:hAnsiTheme="majorHAnsi"/>
       <w:b w:val="0"/>
       <w:bCs w:val="0"/>
-      <w:color w:val="000000"/>
-      <w:sz w:val="24"/>
+      <w:color w:themeColor="accent1" w:themeShade="BF" w:val="365F91"/>
     </w:rPr>
   </w:style>
   <w:style w:type="paragraph" w:customStyle="1" w:styleId="SourceCode">

</xml_diff>